<commit_message>
org + prep 4 eval harness and VS v3
</commit_message>
<xml_diff>
--- a/full_report.docx
+++ b/full_report.docx
@@ -66,7 +66,7 @@
           <w:color w:val="000000"/>
           <w:sz w:val="19"/>
         </w:rPr>
-        <w:t xml:space="preserve"> 2026-06-30T21:38:45.219116Z</w:t>
+        <w:t xml:space="preserve"> 2026-06-30T22:24:01.458256Z</w:t>
       </w:r>
     </w:p>
     <w:p>
@@ -143,7 +143,7 @@
           <w:color w:val="595959"/>
           <w:sz w:val="19"/>
         </w:rPr>
-        <w:t>Elder Care is a multi-market private-pay home care platform serving ~595 clients across NY, NJ, MA, and CT, with reported net revenue of $35.1M (TTM Aug-24) growing to $46.4M on a pro forma adjusted basis, supported by strong client tenure (57% with 4+ years) and a differentiated offshore staffing model, but requiring close scrutiny of a 247% addback-to-reported-EBITDA ratio, multiple intra-document financial discrepancies, and the gap between reported and adjusted earnings.</w:t>
+        <w:t>Elder Care is a multi-market private-pay home care platform serving ~595 clients across NY, NJ, MA, and CT, with reported net revenue of $35.1M and PF adjusted EBITDA of $9.2M (19.9% margin) for TTM Aug-24, supported by strong client tenure (57% with 4+ years) and a differentiated offshore staffing model, but requiring close scrutiny of $11.3M in combined revenue adjustments, a reported EBITDA of only $2.8M, and an addback stack representing ~247% of reported EBITDA.</w:t>
       </w:r>
     </w:p>
     <w:p>
@@ -179,7 +179,7 @@
           <w:color w:val="000000"/>
           <w:sz w:val="19"/>
         </w:rPr>
-        <w:t>Demonstrated organic revenue growth across all legacy markets from 2020 to TTM Aug-24, with Long Island growing from $229K to $11.6M and New York City from $1.5M to $13.6M over the same period, reflecting successful geographic expansion and market penetration.</w:t>
+        <w:t>Demonstrated organic revenue growth from $9.0M (2020A) to $35.1M reported net revenue (TTM Aug-24), with PF adjusted revenue of $46.4M, reflecting consistent multi-year expansion across existing and newly entered geographies</w:t>
       </w:r>
     </w:p>
     <w:p>
@@ -201,7 +201,7 @@
           <w:color w:val="000000"/>
           <w:sz w:val="19"/>
         </w:rPr>
-        <w:t>Exceptionally sticky client base: 57% of active clients have been with the company for 4+ years, and the location average of 60 billed hours per week per client at $1,927/week indicates high-intensity, recurring engagement rather than episodic utilization.</w:t>
+        <w:t>Strong client retention signal: 57% of active clients have been with the company 4+ years, and total client count grew 376% from 125 (Q1-20) to 595 (Q4-24E), indicating durable demand and low voluntary churn</w:t>
       </w:r>
     </w:p>
     <w:p>
@@ -223,7 +223,7 @@
           <w:color w:val="000000"/>
           <w:sz w:val="19"/>
         </w:rPr>
-        <w:t>Differentiated hybrid staffing model with ~41% of the 108-person administrative team based offshore (Philippines), enabling 24/7 on-call, scheduling, recruiting, and billing support at materially lower cost — a structural margin advantage relative to pure domestic operators.</w:t>
+        <w:t>Differentiated hybrid staffing model with ~41% of the 108-person admin team based offshore (Philippines), enabling 24/7 caregiver support, on-call coverage, and scheduling at materially lower cost — a structural margin advantage relative to pure domestic operators</w:t>
       </w:r>
     </w:p>
     <w:p>
@@ -245,7 +245,7 @@
           <w:color w:val="000000"/>
           <w:sz w:val="19"/>
         </w:rPr>
-        <w:t>Seasoned and multi-functional leadership team including a CEO with 8 years of tenure, a COO with enterprise-scale operational experience (Santander, IBM), and an SVP of Sales with 15+ years of long-term care industry relationships across the NY Metro area.</w:t>
+        <w:t>Gross margins are stable and above-average for home care, ranging from 42.1% (2020A) to 43.4% (TTM Aug-24) on a reported basis, with service-level margins reaching up to 64% for RN nursing in select markets</w:t>
       </w:r>
     </w:p>
     <w:p>
@@ -267,7 +267,7 @@
           <w:color w:val="000000"/>
           <w:sz w:val="19"/>
         </w:rPr>
-        <w:t>Gross margin has been stable in the 42–44% range across all reported periods (2020A–TTM Aug-24), demonstrating consistent pricing discipline and cost management despite multi-state expansion and two acquisitions in 2024.</w:t>
+        <w:t>Seasoned executive team with relevant domain depth: CEO David Gilberg (8 years), SVP Sales Trish Paulson (15+ years in long-term care private pay), and COO Todd Abramson with prior scale-up experience at Santander and IBM</w:t>
       </w:r>
     </w:p>
     <w:p>
@@ -289,7 +289,7 @@
           <w:color w:val="000000"/>
           <w:sz w:val="19"/>
         </w:rPr>
-        <w:t>Pro forma adjusted EBITDA of $9.2M at a 19.9% margin (TTM Aug-24) reflects a business that, if addbacks are validated, generates meaningful cash flow at scale; clinic-level EBITDA of $13.9M (30.0% margin) further illustrates the unit economics of the core care delivery model.</w:t>
+        <w:t>64% private-pay revenue mix reduces direct government reimbursement rate risk relative to Medicaid-heavy peers, and the weekly billing model ($1,927/client average) provides high revenue visibility at the individual client level</w:t>
       </w:r>
     </w:p>
     <w:p>
@@ -311,7 +311,21 @@
           <w:color w:val="000000"/>
           <w:sz w:val="19"/>
         </w:rPr>
-        <w:t>Caregiver hiring velocity has accelerated materially — company-wide weekly hires grew from approximately 11 in Q1 2024 to 25–28 in Q1–Q2 2025 — supporting the capacity needed for continued client census growth.</w:t>
+        <w:t>Active inorganic growth strategy with two completed acquisitions in 2024 (Guided Living in MA, Unicity in NJ) adding 181 clients and expanding the geographic footprint to six markets</w:t>
+      </w:r>
+    </w:p>
+    <w:p>
+      <w:pPr>
+        <w:spacing w:before="80" w:after="40"/>
+      </w:pPr>
+      <w:r>
+        <w:rPr>
+          <w:b/>
+          <w:i w:val="0"/>
+          <w:color w:val="000000"/>
+          <w:sz w:val="19"/>
+        </w:rPr>
+        <w:t>Concerns</w:t>
       </w:r>
     </w:p>
     <w:p>
@@ -333,21 +347,7 @@
           <w:color w:val="000000"/>
           <w:sz w:val="19"/>
         </w:rPr>
-        <w:t>Private pay concentration of 64% insulates the business from direct government reimbursement rate risk on the majority of revenue, and the diversified payor mix (LTC insurance, VA, Medicaid waiver) provides multiple demand channels.</w:t>
-      </w:r>
-    </w:p>
-    <w:p>
-      <w:pPr>
-        <w:spacing w:before="80" w:after="40"/>
-      </w:pPr>
-      <w:r>
-        <w:rPr>
-          <w:b/>
-          <w:i w:val="0"/>
-          <w:color w:val="000000"/>
-          <w:sz w:val="19"/>
-        </w:rPr>
-        <w:t>Concerns</w:t>
+        <w:t>Reported EBITDA of $2.8M (7.9% margin, TTM Aug-24) is materially below the PF adjusted figure of $9.2M; the gap is bridged by addbacks totaling approximately 247% of reported EBITDA, including forward-looking synergy and ramp-up adjustments ([N], [O], [P]) that are not yet realized and carry execution risk</w:t>
       </w:r>
     </w:p>
     <w:p>
@@ -369,7 +369,7 @@
           <w:color w:val="000000"/>
           <w:sz w:val="19"/>
         </w:rPr>
-        <w:t>Reported EBITDA has been negative or near-zero in three of the five historical periods presented (2020A: -$342K, 2022A: $180K, 2023A: -$870K), with the TTM Aug-24 reported figure of $2.8M representing the first meaningful positive result — the gap between reported and pro forma adjusted EBITDA ($9.2M) is substantial and requires independent QofE validation.</w:t>
+        <w:t>Combined revenue adjustments of approximately $11.3M ($9.6M diligence + $1.7M pro forma) represent ~32% of the PF adjusted revenue figure of $46.4M — the magnitude and composition of these adjustments require independent QofE validation before any reliance on adjusted figures</w:t>
       </w:r>
     </w:p>
     <w:p>
@@ -391,7 +391,7 @@
           <w:color w:val="000000"/>
           <w:sz w:val="19"/>
         </w:rPr>
-        <w:t>Total addbacks represent approximately 247% of reported EBITDA for TTM Aug-24, including forward-looking synergy and ramp-up adjustments for Guided Living (items N and O) and ECHC de novo maturity (item P) that are prospective estimates rather than historical normalization — these items are particularly susceptible to challenge in a quality of earnings process.</w:t>
+        <w:t>Multiple internal financial discrepancies identified across CIM sections, including conflicting 2023A revenue figures ($33.7M vs. $34.2M), gross profit variances for TTM Aug-24 ($18.5M vs. $20.2M), and EBITDA margin denominator inconsistencies — these require reconciliation with source accounting records</w:t>
       </w:r>
     </w:p>
     <w:p>
@@ -413,7 +413,7 @@
           <w:color w:val="000000"/>
           <w:sz w:val="19"/>
         </w:rPr>
-        <w:t>Pro forma adjusted revenue of $46.4M is approximately 32% higher than reported net revenue of $35.1M for the same TTM period, with $9.6M in diligence revenue adjustments and $1.7M in pro forma revenue adjustments — the nature and supportability of these revenue adjustments must be confirmed with underlying documentation.</w:t>
+        <w:t>Reported EBITDA was negative or near-zero in three of the four historical years (2020A: -$342K, 2022A: $180K, 2023A: -$870K), suggesting the business has only recently achieved meaningful reported profitability and that the adjusted EBITDA trajectory may overstate normalized earnings power</w:t>
       </w:r>
     </w:p>
     <w:p>
@@ -435,7 +435,7 @@
           <w:color w:val="000000"/>
           <w:sz w:val="19"/>
         </w:rPr>
-        <w:t>Multiple intra-document financial discrepancies were identified, including conflicting 2023A revenue figures ($33.7M vs. $34.2M), conflicting TTM Aug-24 gross profit figures ($18.5M vs. $20.2M), and margin percentage inconsistencies across sections of the same CIM — these require reconciliation before financial conclusions can be drawn.</w:t>
+        <w:t>Government and quasi-government payor concentration (Medicaid Waiver 11%, VA 7%, LTC Insurance 11%) totals approximately 29% of stated revenue, with Medicare and Managed Care not separately broken out — actual government exposure may be higher and warrants payor-level reimbursement rate analysis</w:t>
       </w:r>
     </w:p>
     <w:p>
@@ -457,7 +457,7 @@
           <w:color w:val="000000"/>
           <w:sz w:val="19"/>
         </w:rPr>
-        <w:t>No NRR, GRR, or logo churn metrics are available in the data room; while the 4+ year tenure cohort is encouraging, the absence of formal retention analytics limits the ability to assess revenue durability on a forward-looking basis.</w:t>
+        <w:t>Key operational KPIs are absent from the data room: caregiver turnover rate, active client census by period, AR aging by payor, referral source breakdown, and compliance/audit history are not documented — these are primary diligence inputs for a home care platform</w:t>
       </w:r>
     </w:p>
     <w:p>
@@ -479,7 +479,7 @@
           <w:color w:val="000000"/>
           <w:sz w:val="19"/>
         </w:rPr>
-        <w:t>Government and quasi-government payor concentration (Medicaid waiver 11%, VA 7%, plus any Medicare embedded in 'Other') approaches or exceeds 50% when combined, introducing reimbursement rate risk and regulatory compliance obligations that are not yet fully characterized in the available documents.</w:t>
+        <w:t>Two 2024 acquisitions (Guided Living, Unicity) are recent and not yet fully integrated; the PF EBITDA includes pre-acquisition results and forward synergy estimates for both, which have not been independently verified</w:t>
       </w:r>
     </w:p>
     <w:p>
@@ -501,51 +501,7 @@
           <w:color w:val="000000"/>
           <w:sz w:val="19"/>
         </w:rPr>
-        <w:t>Two acquisitions (Guided Living in MA, March 2024; Unicity in NJ, 2024) were completed within the TTM measurement window, meaning a meaningful portion of the pro forma revenue and EBITDA base reflects entities with limited post-acquisition operating history under Elder Care's management — integration execution risk is not yet quantifiable.</w:t>
-      </w:r>
-    </w:p>
-    <w:p>
-      <w:pPr>
-        <w:spacing w:before="20" w:after="20"/>
-        <w:ind w:left="360" w:hanging="259"/>
-      </w:pPr>
-      <w:r>
-        <w:rPr>
-          <w:color w:val="000000"/>
-          <w:sz w:val="19"/>
-        </w:rPr>
-        <w:t xml:space="preserve">• </w:t>
-      </w:r>
-      <w:r>
-        <w:rPr>
-          <w:b w:val="0"/>
-          <w:i w:val="0"/>
-          <w:color w:val="000000"/>
-          <w:sz w:val="19"/>
-        </w:rPr>
-        <w:t>Key operational KPIs required for healthcare services diligence — including caregiver turnover rate, active client census trends, AR aging by payor, referral source breakdown, and compliance/audit history — are absent from the current data room, representing material gaps for a complete operational assessment.</w:t>
-      </w:r>
-    </w:p>
-    <w:p>
-      <w:pPr>
-        <w:spacing w:before="20" w:after="20"/>
-        <w:ind w:left="360" w:hanging="259"/>
-      </w:pPr>
-      <w:r>
-        <w:rPr>
-          <w:color w:val="000000"/>
-          <w:sz w:val="19"/>
-        </w:rPr>
-        <w:t xml:space="preserve">• </w:t>
-      </w:r>
-      <w:r>
-        <w:rPr>
-          <w:b w:val="0"/>
-          <w:i w:val="0"/>
-          <w:color w:val="000000"/>
-          <w:sz w:val="19"/>
-        </w:rPr>
-        <w:t>The Director of Finance has only one year of tenure and the Director of Patient Services only six months, creating potential fragility in two functions (financial controls and clinical compliance) that are critical to a regulated home care business at this stage of growth.</w:t>
+        <w:t>Director of Finance has only 1 year of tenure and Director of Patient Services only 6 months, representing potential gaps in financial controls and clinical oversight during a period of rapid multi-market expansion</w:t>
       </w:r>
     </w:p>
     <w:p>
@@ -13820,43 +13776,7 @@
           <w:color w:val="000000"/>
           <w:sz w:val="19"/>
         </w:rPr>
-        <w:t>2. Provide supporting data for KPI: {'kpi</w:t>
-      </w:r>
-      <w:r>
-        <w:rPr>
-          <w:b w:val="0"/>
-          <w:i/>
-          <w:color w:val="000000"/>
-          <w:sz w:val="19"/>
-        </w:rPr>
-        <w:t>name': 'census / active client count', 'overlay': 'healthcare</w:t>
-      </w:r>
-      <w:r>
-        <w:rPr>
-          <w:b w:val="0"/>
-          <w:i w:val="0"/>
-          <w:color w:val="000000"/>
-          <w:sz w:val="19"/>
-        </w:rPr>
-        <w:t>services', 'why</w:t>
-      </w:r>
-      <w:r>
-        <w:rPr>
-          <w:b w:val="0"/>
-          <w:i/>
-          <w:color w:val="000000"/>
-          <w:sz w:val="19"/>
-        </w:rPr>
-        <w:t>expected': 'Core home care operational metric; total active clients served is required to assess capacity utilization and revenue per client.', 'management</w:t>
-      </w:r>
-      <w:r>
-        <w:rPr>
-          <w:b w:val="0"/>
-          <w:i w:val="0"/>
-          <w:color w:val="000000"/>
-          <w:sz w:val="19"/>
-        </w:rPr>
-        <w:t xml:space="preserve">question': 'What is the current total active client census by market/region, and how has it trended monthly over the past 24 months?'} </w:t>
+        <w:t xml:space="preserve">2. What is the current total active client census by market/region, and how has it trended monthly over the past 24 months? </w:t>
       </w:r>
       <w:r>
         <w:rPr>
@@ -13879,43 +13799,7 @@
           <w:color w:val="000000"/>
           <w:sz w:val="19"/>
         </w:rPr>
-        <w:t>3. Provide supporting data for KPI: {'kpi</w:t>
-      </w:r>
-      <w:r>
-        <w:rPr>
-          <w:b w:val="0"/>
-          <w:i/>
-          <w:color w:val="000000"/>
-          <w:sz w:val="19"/>
-        </w:rPr>
-        <w:t>name': 'caregiver turnover rate', 'overlay': 'healthcare</w:t>
-      </w:r>
-      <w:r>
-        <w:rPr>
-          <w:b w:val="0"/>
-          <w:i w:val="0"/>
-          <w:color w:val="000000"/>
-          <w:sz w:val="19"/>
-        </w:rPr>
-        <w:t>services', 'why</w:t>
-      </w:r>
-      <w:r>
-        <w:rPr>
-          <w:b w:val="0"/>
-          <w:i/>
-          <w:color w:val="000000"/>
-          <w:sz w:val="19"/>
-        </w:rPr>
-        <w:t>expected': 'Caregiver turnover is a primary operational risk and cost driver in home care; no annualized or period turnover rate is stated in any document.', 'management</w:t>
-      </w:r>
-      <w:r>
-        <w:rPr>
-          <w:b w:val="0"/>
-          <w:i w:val="0"/>
-          <w:color w:val="000000"/>
-          <w:sz w:val="19"/>
-        </w:rPr>
-        <w:t xml:space="preserve">question': 'What is the annualized caregiver turnover rate (voluntary and involuntary) by market for the past two fiscal years, and how does it compare to industry benchmarks?'} </w:t>
+        <w:t xml:space="preserve">3. What is the annualized caregiver turnover rate (voluntary and involuntary) by market for the past two fiscal years, and how does it compare to industry benchmarks? </w:t>
       </w:r>
       <w:r>
         <w:rPr>
@@ -13938,43 +13822,7 @@
           <w:color w:val="000000"/>
           <w:sz w:val="19"/>
         </w:rPr>
-        <w:t>4. Provide supporting data for KPI: {'kpi</w:t>
-      </w:r>
-      <w:r>
-        <w:rPr>
-          <w:b w:val="0"/>
-          <w:i/>
-          <w:color w:val="000000"/>
-          <w:sz w:val="19"/>
-        </w:rPr>
-        <w:t>name': 'payor mix breakdown', 'overlay': 'healthcare</w:t>
-      </w:r>
-      <w:r>
-        <w:rPr>
-          <w:b w:val="0"/>
-          <w:i w:val="0"/>
-          <w:color w:val="000000"/>
-          <w:sz w:val="19"/>
-        </w:rPr>
-        <w:t>services', 'why</w:t>
-      </w:r>
-      <w:r>
-        <w:rPr>
-          <w:b w:val="0"/>
-          <w:i/>
-          <w:color w:val="000000"/>
-          <w:sz w:val="19"/>
-        </w:rPr>
-        <w:t>expected': 'Payor mix (Private Pay, Medicaid Waiver, LTC Insurance, VA, Other) is referenced at the company level in the profile but no document provides a current or trended payor mix by market or period.', 'management</w:t>
-      </w:r>
-      <w:r>
-        <w:rPr>
-          <w:b w:val="0"/>
-          <w:i w:val="0"/>
-          <w:color w:val="000000"/>
-          <w:sz w:val="19"/>
-        </w:rPr>
-        <w:t xml:space="preserve">question': 'Can management provide a monthly payor mix breakdown by market for the TTM period, including any shifts in Medicaid Waiver or VA program concentration?'} </w:t>
+        <w:t xml:space="preserve">4. Can management provide a monthly payor mix breakdown by market for the TTM period, including any shifts in Medicaid Waiver or VA program concentration? </w:t>
       </w:r>
       <w:r>
         <w:rPr>
@@ -13997,43 +13845,7 @@
           <w:color w:val="000000"/>
           <w:sz w:val="19"/>
         </w:rPr>
-        <w:t>5. Provide supporting data for KPI: {'kpi</w:t>
-      </w:r>
-      <w:r>
-        <w:rPr>
-          <w:b w:val="0"/>
-          <w:i/>
-          <w:color w:val="000000"/>
-          <w:sz w:val="19"/>
-        </w:rPr>
-        <w:t>name': 'AR aging by payor', 'overlay': 'healthcare</w:t>
-      </w:r>
-      <w:r>
-        <w:rPr>
-          <w:b w:val="0"/>
-          <w:i w:val="0"/>
-          <w:color w:val="000000"/>
-          <w:sz w:val="19"/>
-        </w:rPr>
-        <w:t>services', 'why</w:t>
-      </w:r>
-      <w:r>
-        <w:rPr>
-          <w:b w:val="0"/>
-          <w:i/>
-          <w:color w:val="000000"/>
-          <w:sz w:val="19"/>
-        </w:rPr>
-        <w:t>expected': 'AR aging by payor class is a critical billing health indicator for home care, particularly for government and insurance payors with longer collection cycles.', 'management</w:t>
-      </w:r>
-      <w:r>
-        <w:rPr>
-          <w:b w:val="0"/>
-          <w:i w:val="0"/>
-          <w:color w:val="000000"/>
-          <w:sz w:val="19"/>
-        </w:rPr>
-        <w:t xml:space="preserve">question': 'Please provide an AR aging schedule segmented by payor class (Private Pay, Medicaid Waiver, LTC Insurance, VA) as of the most recent month-end, including DSO by payor.'} </w:t>
+        <w:t xml:space="preserve">5. Please provide an AR aging schedule segmented by payor class (Private Pay, Medicaid Waiver, LTC Insurance, VA) as of the most recent month-end, including DSO by payor. </w:t>
       </w:r>
       <w:r>
         <w:rPr>
@@ -15576,7 +15388,7 @@
           <w:color w:val="595959"/>
           <w:sz w:val="19"/>
         </w:rPr>
-        <w:t>Elder Care presents a home care platform with a compelling organic growth track record, differentiated operational infrastructure, and strong client retention characteristics. The central analytical task for any reviewer is to independently validate the magnitude and quality of the adjustments bridging reported to pro forma financials, reconcile the intra-document discrepancies identified across revenue and gross profit figures, and assess the integration trajectory of the two 2024 acquisitions — outcomes that will materially shape any view of the business's normalized earnings power.</w:t>
+        <w:t>Elder Care presents a home care platform with a compelling client retention profile, a differentiated cost structure, and a multi-year organic growth track record. The key open questions center on the quality and supportability of the adjusted financial figures — particularly the magnitude of addbacks relative to reported EBITDA, the revenue adjustment stack, and the realizability of acquisition synergies — as well as the absence of several standard operational KPIs that are material to assessing care quality, workforce stability, and payor risk. These items should be prioritized in confirmatory diligence before forming a view on normalized earnings power.</w:t>
       </w:r>
     </w:p>
     <w:sectPr>

</xml_diff>